<commit_message>
sidste ændringer til PROCES + pdf
</commit_message>
<xml_diff>
--- a/RapportDoc/ProcesRapport - H5 Mini.docx
+++ b/RapportDoc/ProcesRapport - H5 Mini.docx
@@ -348,8 +348,8 @@
               <w:b w:val="0"/>
               <w:bCs w:val="0"/>
               <w:noProof/>
-              <w:sz w:val="24"/>
-              <w:szCs w:val="24"/>
+              <w:sz w:val="36"/>
+              <w:szCs w:val="36"/>
               <w:lang w:eastAsia="da-DK"/>
             </w:rPr>
           </w:pPr>
@@ -378,7 +378,7 @@
             </w:rPr>
             <w:fldChar w:fldCharType="separate"/>
           </w:r>
-          <w:hyperlink w:anchor="_Toc230210578" w:history="1">
+          <w:hyperlink w:anchor="_Toc230211773" w:history="1">
             <w:r>
               <w:rPr>
                 <w:rStyle w:val="Hyperlink"/>
@@ -413,7 +413,7 @@
                 <w:sz w:val="24"/>
                 <w:szCs w:val="24"/>
               </w:rPr>
-              <w:instrText xml:space="preserve"> PAGEREF _Toc230210578 \h </w:instrText>
+              <w:instrText xml:space="preserve"> PAGEREF _Toc230211773 \h </w:instrText>
             </w:r>
             <w:r>
               <w:rPr>
@@ -464,12 +464,12 @@
               <w:i w:val="0"/>
               <w:iCs w:val="0"/>
               <w:noProof/>
-              <w:sz w:val="24"/>
-              <w:szCs w:val="24"/>
+              <w:sz w:val="36"/>
+              <w:szCs w:val="36"/>
               <w:lang w:eastAsia="da-DK"/>
             </w:rPr>
           </w:pPr>
-          <w:hyperlink w:anchor="_Toc230210579" w:history="1">
+          <w:hyperlink w:anchor="_Toc230211774" w:history="1">
             <w:r>
               <w:rPr>
                 <w:rStyle w:val="Hyperlink"/>
@@ -504,7 +504,7 @@
                 <w:sz w:val="24"/>
                 <w:szCs w:val="24"/>
               </w:rPr>
-              <w:instrText xml:space="preserve"> PAGEREF _Toc230210579 \h </w:instrText>
+              <w:instrText xml:space="preserve"> PAGEREF _Toc230211774 \h </w:instrText>
             </w:r>
             <w:r>
               <w:rPr>
@@ -553,12 +553,12 @@
             <w:rPr>
               <w:rFonts w:eastAsiaTheme="minorEastAsia"/>
               <w:noProof/>
-              <w:sz w:val="24"/>
-              <w:szCs w:val="24"/>
+              <w:sz w:val="36"/>
+              <w:szCs w:val="36"/>
               <w:lang w:eastAsia="da-DK"/>
             </w:rPr>
           </w:pPr>
-          <w:hyperlink w:anchor="_Toc230210580" w:history="1">
+          <w:hyperlink w:anchor="_Toc230211775" w:history="1">
             <w:r>
               <w:rPr>
                 <w:rStyle w:val="Hyperlink"/>
@@ -593,7 +593,7 @@
                 <w:sz w:val="24"/>
                 <w:szCs w:val="24"/>
               </w:rPr>
-              <w:instrText xml:space="preserve"> PAGEREF _Toc230210580 \h </w:instrText>
+              <w:instrText xml:space="preserve"> PAGEREF _Toc230211775 \h </w:instrText>
             </w:r>
             <w:r>
               <w:rPr>
@@ -644,12 +644,12 @@
               <w:b w:val="0"/>
               <w:bCs w:val="0"/>
               <w:noProof/>
-              <w:sz w:val="24"/>
-              <w:szCs w:val="24"/>
+              <w:sz w:val="36"/>
+              <w:szCs w:val="36"/>
               <w:lang w:eastAsia="da-DK"/>
             </w:rPr>
           </w:pPr>
-          <w:hyperlink w:anchor="_Toc230210581" w:history="1">
+          <w:hyperlink w:anchor="_Toc230211776" w:history="1">
             <w:r>
               <w:rPr>
                 <w:rStyle w:val="Hyperlink"/>
@@ -684,7 +684,7 @@
                 <w:sz w:val="24"/>
                 <w:szCs w:val="24"/>
               </w:rPr>
-              <w:instrText xml:space="preserve"> PAGEREF _Toc230210581 \h </w:instrText>
+              <w:instrText xml:space="preserve"> PAGEREF _Toc230211776 \h </w:instrText>
             </w:r>
             <w:r>
               <w:rPr>
@@ -735,12 +735,12 @@
               <w:i w:val="0"/>
               <w:iCs w:val="0"/>
               <w:noProof/>
-              <w:sz w:val="24"/>
-              <w:szCs w:val="24"/>
+              <w:sz w:val="36"/>
+              <w:szCs w:val="36"/>
               <w:lang w:eastAsia="da-DK"/>
             </w:rPr>
           </w:pPr>
-          <w:hyperlink w:anchor="_Toc230210582" w:history="1">
+          <w:hyperlink w:anchor="_Toc230211777" w:history="1">
             <w:r>
               <w:rPr>
                 <w:rStyle w:val="Hyperlink"/>
@@ -775,7 +775,7 @@
                 <w:sz w:val="24"/>
                 <w:szCs w:val="24"/>
               </w:rPr>
-              <w:instrText xml:space="preserve"> PAGEREF _Toc230210582 \h </w:instrText>
+              <w:instrText xml:space="preserve"> PAGEREF _Toc230211777 \h </w:instrText>
             </w:r>
             <w:r>
               <w:rPr>
@@ -826,12 +826,12 @@
               <w:i w:val="0"/>
               <w:iCs w:val="0"/>
               <w:noProof/>
-              <w:sz w:val="24"/>
-              <w:szCs w:val="24"/>
+              <w:sz w:val="36"/>
+              <w:szCs w:val="36"/>
               <w:lang w:eastAsia="da-DK"/>
             </w:rPr>
           </w:pPr>
-          <w:hyperlink w:anchor="_Toc230210583" w:history="1">
+          <w:hyperlink w:anchor="_Toc230211778" w:history="1">
             <w:r>
               <w:rPr>
                 <w:rStyle w:val="Hyperlink"/>
@@ -866,7 +866,7 @@
                 <w:sz w:val="24"/>
                 <w:szCs w:val="24"/>
               </w:rPr>
-              <w:instrText xml:space="preserve"> PAGEREF _Toc230210583 \h </w:instrText>
+              <w:instrText xml:space="preserve"> PAGEREF _Toc230211778 \h </w:instrText>
             </w:r>
             <w:r>
               <w:rPr>
@@ -915,12 +915,12 @@
             <w:rPr>
               <w:rFonts w:eastAsiaTheme="minorEastAsia"/>
               <w:noProof/>
-              <w:sz w:val="24"/>
-              <w:szCs w:val="24"/>
+              <w:sz w:val="36"/>
+              <w:szCs w:val="36"/>
               <w:lang w:eastAsia="da-DK"/>
             </w:rPr>
           </w:pPr>
-          <w:hyperlink w:anchor="_Toc230210584" w:history="1">
+          <w:hyperlink w:anchor="_Toc230211779" w:history="1">
             <w:r>
               <w:rPr>
                 <w:rStyle w:val="Hyperlink"/>
@@ -955,7 +955,7 @@
                 <w:sz w:val="24"/>
                 <w:szCs w:val="24"/>
               </w:rPr>
-              <w:instrText xml:space="preserve"> PAGEREF _Toc230210584 \h </w:instrText>
+              <w:instrText xml:space="preserve"> PAGEREF _Toc230211779 \h </w:instrText>
             </w:r>
             <w:r>
               <w:rPr>
@@ -1004,12 +1004,12 @@
             <w:rPr>
               <w:rFonts w:eastAsiaTheme="minorEastAsia"/>
               <w:noProof/>
-              <w:sz w:val="24"/>
-              <w:szCs w:val="24"/>
+              <w:sz w:val="36"/>
+              <w:szCs w:val="36"/>
               <w:lang w:eastAsia="da-DK"/>
             </w:rPr>
           </w:pPr>
-          <w:hyperlink w:anchor="_Toc230210585" w:history="1">
+          <w:hyperlink w:anchor="_Toc230211780" w:history="1">
             <w:r>
               <w:rPr>
                 <w:rStyle w:val="Hyperlink"/>
@@ -1044,7 +1044,7 @@
                 <w:sz w:val="24"/>
                 <w:szCs w:val="24"/>
               </w:rPr>
-              <w:instrText xml:space="preserve"> PAGEREF _Toc230210585 \h </w:instrText>
+              <w:instrText xml:space="preserve"> PAGEREF _Toc230211780 \h </w:instrText>
             </w:r>
             <w:r>
               <w:rPr>
@@ -1093,12 +1093,12 @@
             <w:rPr>
               <w:rFonts w:eastAsiaTheme="minorEastAsia"/>
               <w:noProof/>
-              <w:sz w:val="24"/>
-              <w:szCs w:val="24"/>
+              <w:sz w:val="36"/>
+              <w:szCs w:val="36"/>
               <w:lang w:eastAsia="da-DK"/>
             </w:rPr>
           </w:pPr>
-          <w:hyperlink w:anchor="_Toc230210586" w:history="1">
+          <w:hyperlink w:anchor="_Toc230211781" w:history="1">
             <w:r>
               <w:rPr>
                 <w:rStyle w:val="Hyperlink"/>
@@ -1133,7 +1133,7 @@
                 <w:sz w:val="24"/>
                 <w:szCs w:val="24"/>
               </w:rPr>
-              <w:instrText xml:space="preserve"> PAGEREF _Toc230210586 \h </w:instrText>
+              <w:instrText xml:space="preserve"> PAGEREF _Toc230211781 \h </w:instrText>
             </w:r>
             <w:r>
               <w:rPr>
@@ -1184,12 +1184,12 @@
               <w:b w:val="0"/>
               <w:bCs w:val="0"/>
               <w:noProof/>
-              <w:sz w:val="24"/>
-              <w:szCs w:val="24"/>
+              <w:sz w:val="36"/>
+              <w:szCs w:val="36"/>
               <w:lang w:eastAsia="da-DK"/>
             </w:rPr>
           </w:pPr>
-          <w:hyperlink w:anchor="_Toc230210587" w:history="1">
+          <w:hyperlink w:anchor="_Toc230211782" w:history="1">
             <w:r>
               <w:rPr>
                 <w:rStyle w:val="Hyperlink"/>
@@ -1224,7 +1224,7 @@
                 <w:sz w:val="24"/>
                 <w:szCs w:val="24"/>
               </w:rPr>
-              <w:instrText xml:space="preserve"> PAGEREF _Toc230210587 \h </w:instrText>
+              <w:instrText xml:space="preserve"> PAGEREF _Toc230211782 \h </w:instrText>
             </w:r>
             <w:r>
               <w:rPr>
@@ -1275,12 +1275,12 @@
               <w:b w:val="0"/>
               <w:bCs w:val="0"/>
               <w:noProof/>
-              <w:sz w:val="24"/>
-              <w:szCs w:val="24"/>
+              <w:sz w:val="36"/>
+              <w:szCs w:val="36"/>
               <w:lang w:eastAsia="da-DK"/>
             </w:rPr>
           </w:pPr>
-          <w:hyperlink w:anchor="_Toc230210588" w:history="1">
+          <w:hyperlink w:anchor="_Toc230211783" w:history="1">
             <w:r>
               <w:rPr>
                 <w:rStyle w:val="Hyperlink"/>
@@ -1315,7 +1315,7 @@
                 <w:sz w:val="24"/>
                 <w:szCs w:val="24"/>
               </w:rPr>
-              <w:instrText xml:space="preserve"> PAGEREF _Toc230210588 \h </w:instrText>
+              <w:instrText xml:space="preserve"> PAGEREF _Toc230211783 \h </w:instrText>
             </w:r>
             <w:r>
               <w:rPr>
@@ -1388,7 +1388,7 @@
         </w:rPr>
       </w:pPr>
       <w:bookmarkStart w:id="0" w:name="_Toc200442265"/>
-      <w:bookmarkStart w:id="1" w:name="_Toc230210578"/>
+      <w:bookmarkStart w:id="1" w:name="_Toc230211773"/>
       <w:r>
         <w:rPr>
           <w:rStyle w:val="Overskrift1Tegn"/>
@@ -1810,7 +1810,7 @@
           <w:szCs w:val="24"/>
         </w:rPr>
       </w:pPr>
-      <w:bookmarkStart w:id="2" w:name="_Toc230210579"/>
+      <w:bookmarkStart w:id="2" w:name="_Toc230211774"/>
       <w:r>
         <w:rPr>
           <w:rStyle w:val="Overskrift2Tegn"/>
@@ -1825,7 +1825,7 @@
         <w:pStyle w:val="Overskrift3"/>
         <w:spacing w:line="360" w:lineRule="auto"/>
       </w:pPr>
-      <w:bookmarkStart w:id="3" w:name="_Toc230210580"/>
+      <w:bookmarkStart w:id="3" w:name="_Toc230211775"/>
       <w:r>
         <w:t>Projektets idé</w:t>
       </w:r>
@@ -2038,7 +2038,7 @@
       <w:pPr>
         <w:pStyle w:val="Overskrift1"/>
       </w:pPr>
-      <w:bookmarkStart w:id="4" w:name="_Toc230210581"/>
+      <w:bookmarkStart w:id="4" w:name="_Toc230211776"/>
       <w:r>
         <w:lastRenderedPageBreak/>
         <w:t>Projektplanlægning</w:t>
@@ -2050,7 +2050,7 @@
         <w:pStyle w:val="Overskrift2"/>
         <w:spacing w:line="360" w:lineRule="auto"/>
       </w:pPr>
-      <w:bookmarkStart w:id="5" w:name="_Toc230210582"/>
+      <w:bookmarkStart w:id="5" w:name="_Toc230211777"/>
       <w:r>
         <w:t>Estimeret tidsplan</w:t>
       </w:r>
@@ -2405,15 +2405,13 @@
           <w:szCs w:val="24"/>
         </w:rPr>
       </w:pPr>
-      <w:proofErr w:type="gramStart"/>
-      <w:r>
-        <w:rPr>
-          <w:sz w:val="24"/>
-          <w:szCs w:val="24"/>
-        </w:rPr>
-        <w:t>CRUD funktionalitet</w:t>
-      </w:r>
-      <w:proofErr w:type="gramEnd"/>
+      <w:r>
+        <w:rPr>
+          <w:sz w:val="24"/>
+          <w:szCs w:val="24"/>
+        </w:rPr>
+        <w:t>CRUD-funktionalitet</w:t>
+      </w:r>
     </w:p>
     <w:p>
       <w:pPr>
@@ -2595,15 +2593,13 @@
           <w:szCs w:val="24"/>
         </w:rPr>
       </w:pPr>
-      <w:proofErr w:type="spellStart"/>
-      <w:r>
-        <w:rPr>
-          <w:sz w:val="24"/>
-          <w:szCs w:val="24"/>
-        </w:rPr>
-        <w:t>Testing</w:t>
-      </w:r>
-      <w:proofErr w:type="spellEnd"/>
+      <w:r>
+        <w:rPr>
+          <w:sz w:val="24"/>
+          <w:szCs w:val="24"/>
+        </w:rPr>
+        <w:t>Testning</w:t>
+      </w:r>
     </w:p>
     <w:p>
       <w:pPr>
@@ -2639,15 +2635,13 @@
           <w:szCs w:val="24"/>
         </w:rPr>
       </w:pPr>
-      <w:proofErr w:type="gramStart"/>
-      <w:r>
-        <w:rPr>
-          <w:sz w:val="24"/>
-          <w:szCs w:val="24"/>
-        </w:rPr>
-        <w:t>UI forbedringer</w:t>
-      </w:r>
-      <w:proofErr w:type="gramEnd"/>
+      <w:r>
+        <w:rPr>
+          <w:sz w:val="24"/>
+          <w:szCs w:val="24"/>
+        </w:rPr>
+        <w:t>UI-forbedringer</w:t>
+      </w:r>
     </w:p>
     <w:p>
       <w:pPr>
@@ -2721,8 +2715,8 @@
           <w:rFonts w:ascii="Arial" w:hAnsi="Arial" w:cs="Arial"/>
           <w:noProof/>
           <w:color w:val="000000"/>
-          <w:sz w:val="40"/>
-          <w:szCs w:val="40"/>
+          <w:sz w:val="44"/>
+          <w:szCs w:val="44"/>
           <w:bdr w:val="none" w:sz="0" w:space="0" w:color="auto" w:frame="1"/>
         </w:rPr>
         <w:drawing>
@@ -2797,6 +2791,10 @@
         </w:drawing>
       </w:r>
       <w:r>
+        <w:rPr>
+          <w:sz w:val="24"/>
+          <w:szCs w:val="24"/>
+        </w:rPr>
         <w:t>Aflevering</w:t>
       </w:r>
     </w:p>
@@ -2805,7 +2803,7 @@
         <w:pStyle w:val="Overskrift2"/>
         <w:spacing w:line="360" w:lineRule="auto"/>
       </w:pPr>
-      <w:bookmarkStart w:id="6" w:name="_Toc230210583"/>
+      <w:bookmarkStart w:id="6" w:name="_Toc230211778"/>
       <w:r>
         <w:t>Realise</w:t>
       </w:r>
@@ -3079,15 +3077,13 @@
         </w:rPr>
         <w:t>UI/</w:t>
       </w:r>
-      <w:proofErr w:type="gramStart"/>
-      <w:r>
-        <w:rPr>
-          <w:sz w:val="24"/>
-          <w:szCs w:val="24"/>
-        </w:rPr>
-        <w:t>UX forbedringer</w:t>
-      </w:r>
-      <w:proofErr w:type="gramEnd"/>
+      <w:r>
+        <w:rPr>
+          <w:sz w:val="24"/>
+          <w:szCs w:val="24"/>
+        </w:rPr>
+        <w:t>UX-forbedringer</w:t>
+      </w:r>
     </w:p>
     <w:p>
       <w:pPr>
@@ -3182,7 +3178,7 @@
         <w:pStyle w:val="Overskrift3"/>
         <w:spacing w:line="360" w:lineRule="auto"/>
       </w:pPr>
-      <w:bookmarkStart w:id="7" w:name="_Toc230210584"/>
+      <w:bookmarkStart w:id="7" w:name="_Toc230211779"/>
       <w:r>
         <w:t>Udviklingsmetode</w:t>
       </w:r>
@@ -3432,7 +3428,7 @@
         <w:pStyle w:val="Overskrift3"/>
         <w:spacing w:line="360" w:lineRule="auto"/>
       </w:pPr>
-      <w:bookmarkStart w:id="8" w:name="_Toc230210585"/>
+      <w:bookmarkStart w:id="8" w:name="_Toc230211780"/>
       <w:r>
         <w:lastRenderedPageBreak/>
         <w:t>Prioritering af funktioner</w:t>
@@ -3681,7 +3677,7 @@
         <w:pStyle w:val="Overskrift3"/>
         <w:spacing w:line="360" w:lineRule="auto"/>
       </w:pPr>
-      <w:bookmarkStart w:id="9" w:name="_Toc230210586"/>
+      <w:bookmarkStart w:id="9" w:name="_Toc230211781"/>
       <w:r>
         <w:t>Versionsstyring</w:t>
       </w:r>
@@ -3884,7 +3880,7 @@
         <w:pStyle w:val="Overskrift1"/>
         <w:spacing w:line="360" w:lineRule="auto"/>
       </w:pPr>
-      <w:bookmarkStart w:id="10" w:name="_Toc230210587"/>
+      <w:bookmarkStart w:id="10" w:name="_Toc230211782"/>
       <w:r>
         <w:lastRenderedPageBreak/>
         <w:t>Logbog</w:t>
@@ -4159,15 +4155,13 @@
           <w:szCs w:val="24"/>
         </w:rPr>
       </w:pPr>
-      <w:proofErr w:type="gramStart"/>
-      <w:r>
-        <w:rPr>
-          <w:sz w:val="24"/>
-          <w:szCs w:val="24"/>
-        </w:rPr>
-        <w:t>CRUD funktionalitet</w:t>
-      </w:r>
-      <w:proofErr w:type="gramEnd"/>
+      <w:r>
+        <w:rPr>
+          <w:sz w:val="24"/>
+          <w:szCs w:val="24"/>
+        </w:rPr>
+        <w:t>CRUD-funktionalitet</w:t>
+      </w:r>
       <w:r>
         <w:rPr>
           <w:sz w:val="24"/>
@@ -4325,6 +4319,15 @@
       <w:pPr>
         <w:spacing w:line="360" w:lineRule="auto"/>
         <w:rPr>
+          <w:sz w:val="24"/>
+          <w:szCs w:val="24"/>
+        </w:rPr>
+      </w:pPr>
+    </w:p>
+    <w:p>
+      <w:pPr>
+        <w:spacing w:line="360" w:lineRule="auto"/>
+        <w:rPr>
           <w:b/>
           <w:bCs/>
           <w:sz w:val="24"/>
@@ -4338,6 +4341,7 @@
           <w:sz w:val="24"/>
           <w:szCs w:val="24"/>
         </w:rPr>
+        <w:lastRenderedPageBreak/>
         <w:t>Dag 8 – 29.04.2026 – Sprint 2</w:t>
       </w:r>
     </w:p>
@@ -4354,8 +4358,7 @@
           <w:sz w:val="24"/>
           <w:szCs w:val="24"/>
         </w:rPr>
-        <w:lastRenderedPageBreak/>
-        <w:t xml:space="preserve">Vi påbegyndte integrationen af </w:t>
+        <w:t xml:space="preserve">Vi begyndte integrationen af </w:t>
       </w:r>
       <w:proofErr w:type="spellStart"/>
       <w:r>
@@ -4387,7 +4390,23 @@
           <w:sz w:val="24"/>
           <w:szCs w:val="24"/>
         </w:rPr>
-        <w:t xml:space="preserve"> for at understøtte real-time samarbejde mellem flere brugere.</w:t>
+        <w:t xml:space="preserve"> for at understøtte real-time samarbejde mellem flere brugere. Det blev hurtigt tydeligt, at denne del af projektet var mere kompleks end forventet, særligt i forhold til synkronisering mellem klienter og håndtering af editor-</w:t>
+      </w:r>
+      <w:proofErr w:type="spellStart"/>
+      <w:r>
+        <w:rPr>
+          <w:sz w:val="24"/>
+          <w:szCs w:val="24"/>
+        </w:rPr>
+        <w:t>state</w:t>
+      </w:r>
+      <w:proofErr w:type="spellEnd"/>
+      <w:r>
+        <w:rPr>
+          <w:sz w:val="24"/>
+          <w:szCs w:val="24"/>
+        </w:rPr>
+        <w:t>.</w:t>
       </w:r>
     </w:p>
     <w:p>
@@ -4471,7 +4490,14 @@
           <w:sz w:val="24"/>
           <w:szCs w:val="24"/>
         </w:rPr>
-        <w:t xml:space="preserve"> og research.</w:t>
+        <w:t xml:space="preserve"> og research i dokumentation, da ændringer ikke altid blev synkroniseret korrekt mellem browserfaner</w:t>
+      </w:r>
+      <w:r>
+        <w:rPr>
+          <w:sz w:val="24"/>
+          <w:szCs w:val="24"/>
+        </w:rPr>
+        <w:t>.</w:t>
       </w:r>
     </w:p>
     <w:p>
@@ -4516,7 +4542,7 @@
           <w:sz w:val="24"/>
           <w:szCs w:val="24"/>
         </w:rPr>
-        <w:t xml:space="preserve"> af dokumentdata blev implementeret. Målet var at undgå databasekald ved hvert tastetryk, hvilket blev løst gennem en </w:t>
+        <w:t xml:space="preserve"> af dokumentdata blev implementeret gennem en </w:t>
       </w:r>
       <w:proofErr w:type="spellStart"/>
       <w:r>
@@ -4548,7 +4574,23 @@
           <w:sz w:val="24"/>
           <w:szCs w:val="24"/>
         </w:rPr>
-        <w:t xml:space="preserve"> strategi.</w:t>
+        <w:t xml:space="preserve"> strategi. Vi brugte tid på at finde en løsning, der kunne gemme dokumenter stabilt uden at sende databasekald ved hvert tastetryk, da </w:t>
+      </w:r>
+      <w:proofErr w:type="gramStart"/>
+      <w:r>
+        <w:rPr>
+          <w:sz w:val="24"/>
+          <w:szCs w:val="24"/>
+        </w:rPr>
+        <w:t>dette påvirkede performance</w:t>
+      </w:r>
+      <w:proofErr w:type="gramEnd"/>
+      <w:r>
+        <w:rPr>
+          <w:sz w:val="24"/>
+          <w:szCs w:val="24"/>
+        </w:rPr>
+        <w:t xml:space="preserve"> negativt.</w:t>
       </w:r>
     </w:p>
     <w:p>
@@ -4740,8 +4782,33 @@
           <w:sz w:val="24"/>
           <w:szCs w:val="24"/>
         </w:rPr>
-        <w:t xml:space="preserve"> problemer i Next.js krævede justeringer.</w:t>
-      </w:r>
+        <w:t xml:space="preserve"> problemer i Next.js krævede flere ændringer i komponentstrukturen og opdelingen mellem server components og </w:t>
+      </w:r>
+      <w:proofErr w:type="spellStart"/>
+      <w:r>
+        <w:rPr>
+          <w:sz w:val="24"/>
+          <w:szCs w:val="24"/>
+        </w:rPr>
+        <w:t>client</w:t>
+      </w:r>
+      <w:proofErr w:type="spellEnd"/>
+      <w:r>
+        <w:rPr>
+          <w:sz w:val="24"/>
+          <w:szCs w:val="24"/>
+        </w:rPr>
+        <w:t xml:space="preserve"> components.</w:t>
+      </w:r>
+    </w:p>
+    <w:p>
+      <w:pPr>
+        <w:spacing w:line="360" w:lineRule="auto"/>
+        <w:rPr>
+          <w:sz w:val="24"/>
+          <w:szCs w:val="24"/>
+        </w:rPr>
+      </w:pPr>
     </w:p>
     <w:p>
       <w:pPr>
@@ -4760,6 +4827,7 @@
           <w:sz w:val="24"/>
           <w:szCs w:val="24"/>
         </w:rPr>
+        <w:lastRenderedPageBreak/>
         <w:t>Dag 15 – 08.05.2026 – Sprint 3</w:t>
       </w:r>
     </w:p>
@@ -4812,7 +4880,23 @@
           <w:sz w:val="24"/>
           <w:szCs w:val="24"/>
         </w:rPr>
-        <w:t>Fokus var på kvalitetssikring og manuel test af systemets vigtigste funktioner.</w:t>
+        <w:t xml:space="preserve">Fokus var på kvalitetssikring og manuel test af systemets vigtigste funktioner. Gennem testene opdagede vi mindre fejl i navigation, </w:t>
+      </w:r>
+      <w:proofErr w:type="spellStart"/>
+      <w:r>
+        <w:rPr>
+          <w:sz w:val="24"/>
+          <w:szCs w:val="24"/>
+        </w:rPr>
+        <w:t>persistence</w:t>
+      </w:r>
+      <w:proofErr w:type="spellEnd"/>
+      <w:r>
+        <w:rPr>
+          <w:sz w:val="24"/>
+          <w:szCs w:val="24"/>
+        </w:rPr>
+        <w:t xml:space="preserve"> og real-time synkronisering, som efterfølgende blev rettet.</w:t>
       </w:r>
     </w:p>
     <w:p>
@@ -4848,7 +4932,6 @@
           <w:sz w:val="24"/>
           <w:szCs w:val="24"/>
         </w:rPr>
-        <w:lastRenderedPageBreak/>
         <w:t xml:space="preserve">Vi testede </w:t>
       </w:r>
       <w:proofErr w:type="spellStart"/>
@@ -4919,15 +5002,13 @@
         </w:rPr>
         <w:t xml:space="preserve">Der blev arbejdet videre med mindre </w:t>
       </w:r>
-      <w:proofErr w:type="gramStart"/>
-      <w:r>
-        <w:rPr>
-          <w:sz w:val="24"/>
-          <w:szCs w:val="24"/>
-        </w:rPr>
-        <w:t>UI forbedringer</w:t>
-      </w:r>
-      <w:proofErr w:type="gramEnd"/>
+      <w:r>
+        <w:rPr>
+          <w:sz w:val="24"/>
+          <w:szCs w:val="24"/>
+        </w:rPr>
+        <w:t>UI-forbedringer</w:t>
+      </w:r>
       <w:r>
         <w:rPr>
           <w:sz w:val="24"/>
@@ -5041,23 +5122,21 @@
           <w:sz w:val="24"/>
           <w:szCs w:val="24"/>
         </w:rPr>
-        <w:t xml:space="preserve">Vi begyndte arbejdet med dokumentation, produktrapport og </w:t>
-      </w:r>
-      <w:proofErr w:type="spellStart"/>
-      <w:r>
-        <w:rPr>
-          <w:sz w:val="24"/>
-          <w:szCs w:val="24"/>
-        </w:rPr>
-        <w:t>processrapport</w:t>
-      </w:r>
-      <w:proofErr w:type="spellEnd"/>
-      <w:r>
-        <w:rPr>
-          <w:sz w:val="24"/>
-          <w:szCs w:val="24"/>
-        </w:rPr>
-        <w:t>.</w:t>
+        <w:t>Vi arbejde</w:t>
+      </w:r>
+      <w:r>
+        <w:rPr>
+          <w:sz w:val="24"/>
+          <w:szCs w:val="24"/>
+        </w:rPr>
+        <w:t>de</w:t>
+      </w:r>
+      <w:r>
+        <w:rPr>
+          <w:sz w:val="24"/>
+          <w:szCs w:val="24"/>
+        </w:rPr>
+        <w:t xml:space="preserve"> med dokumentation, produktrapport og procesrapport.</w:t>
       </w:r>
     </w:p>
     <w:p>
@@ -5100,6 +5179,24 @@
       <w:pPr>
         <w:spacing w:line="360" w:lineRule="auto"/>
         <w:rPr>
+          <w:sz w:val="24"/>
+          <w:szCs w:val="24"/>
+        </w:rPr>
+      </w:pPr>
+    </w:p>
+    <w:p>
+      <w:pPr>
+        <w:spacing w:line="360" w:lineRule="auto"/>
+        <w:rPr>
+          <w:sz w:val="24"/>
+          <w:szCs w:val="24"/>
+        </w:rPr>
+      </w:pPr>
+    </w:p>
+    <w:p>
+      <w:pPr>
+        <w:spacing w:line="360" w:lineRule="auto"/>
+        <w:rPr>
           <w:b/>
           <w:bCs/>
           <w:sz w:val="24"/>
@@ -5113,6 +5210,7 @@
           <w:sz w:val="24"/>
           <w:szCs w:val="24"/>
         </w:rPr>
+        <w:lastRenderedPageBreak/>
         <w:t>Dag 23 – 20.05.2026 – Sprint 5 (Afleveringsdag)</w:t>
       </w:r>
     </w:p>
@@ -5120,6 +5218,9 @@
       <w:pPr>
         <w:spacing w:line="360" w:lineRule="auto"/>
         <w:rPr>
+          <w:rStyle w:val="Overskrift1Tegn"/>
+          <w:rFonts w:asciiTheme="minorHAnsi" w:eastAsiaTheme="minorHAnsi" w:hAnsiTheme="minorHAnsi" w:cstheme="minorBidi"/>
+          <w:color w:val="auto"/>
           <w:sz w:val="24"/>
           <w:szCs w:val="24"/>
         </w:rPr>
@@ -5135,45 +5236,12 @@
     <w:p>
       <w:pPr>
         <w:spacing w:line="360" w:lineRule="auto"/>
+      </w:pPr>
+      <w:bookmarkStart w:id="11" w:name="_Toc230211783"/>
+      <w:r>
         <w:rPr>
           <w:rStyle w:val="Overskrift1Tegn"/>
         </w:rPr>
-      </w:pPr>
-    </w:p>
-    <w:p>
-      <w:pPr>
-        <w:spacing w:line="360" w:lineRule="auto"/>
-        <w:rPr>
-          <w:rStyle w:val="Overskrift1Tegn"/>
-        </w:rPr>
-      </w:pPr>
-    </w:p>
-    <w:p>
-      <w:pPr>
-        <w:spacing w:line="360" w:lineRule="auto"/>
-        <w:rPr>
-          <w:rStyle w:val="Overskrift1Tegn"/>
-        </w:rPr>
-      </w:pPr>
-    </w:p>
-    <w:p>
-      <w:pPr>
-        <w:spacing w:line="360" w:lineRule="auto"/>
-        <w:rPr>
-          <w:rStyle w:val="Overskrift1Tegn"/>
-        </w:rPr>
-      </w:pPr>
-    </w:p>
-    <w:p>
-      <w:pPr>
-        <w:spacing w:line="360" w:lineRule="auto"/>
-      </w:pPr>
-      <w:bookmarkStart w:id="11" w:name="_Toc230210588"/>
-      <w:r>
-        <w:rPr>
-          <w:rStyle w:val="Overskrift1Tegn"/>
-        </w:rPr>
-        <w:lastRenderedPageBreak/>
         <w:t>Konklusion</w:t>
       </w:r>
       <w:bookmarkEnd w:id="11"/>
@@ -5698,24 +5766,7 @@
       </w:p>
     </w:sdtContent>
   </w:sdt>
-  <w:p>
-    <w:pPr>
-      <w:pStyle w:val="Sidefod"/>
-      <w:ind w:right="360"/>
-      <w:jc w:val="center"/>
-      <w:rPr>
-        <w:sz w:val="24"/>
-        <w:szCs w:val="24"/>
-      </w:rPr>
-    </w:pPr>
-    <w:r>
-      <w:rPr>
-        <w:sz w:val="24"/>
-        <w:szCs w:val="24"/>
-      </w:rPr>
-      <w:t>Startdato: 20.04.2026 - Afleveringsdato: 20.05.2026 – Projekt: Studie Hub</w:t>
-    </w:r>
-  </w:p>
+  <w:p/>
 </w:ftr>
 </file>
 

</xml_diff>